<commit_message>
Add instructional images to AP invoice guide
</commit_message>
<xml_diff>
--- a/docs/training/TITAN Invoice Approval AP Guide.docx
+++ b/docs/training/TITAN Invoice Approval AP Guide.docx
@@ -615,6 +615,74 @@
       </w:r>
       <w:r>
         <w:t>Automatic extraction helps with data entry, but AP remains responsible for verifying the invoice against the source document.</w:t>
+      </w:r>
+    </w:p>
+    <w:p>
+      <w:pPr>
+        <w:keepLines/>
+        <w:spacing w:before="160" w:after="80"/>
+        <w:jc w:val="center"/>
+      </w:pPr>
+      <w:r>
+        <w:drawing>
+          <wp:inline xmlns:a="http://schemas.openxmlformats.org/drawingml/2006/main" xmlns:pic="http://schemas.openxmlformats.org/drawingml/2006/picture">
+            <wp:extent cx="6400800" cy="3720465"/>
+            <wp:docPr id="1" name="Picture 1"/>
+            <wp:cNvGraphicFramePr>
+              <a:graphicFrameLocks noChangeAspect="1"/>
+            </wp:cNvGraphicFramePr>
+            <a:graphic>
+              <a:graphicData uri="http://schemas.openxmlformats.org/drawingml/2006/picture">
+                <pic:pic>
+                  <pic:nvPicPr>
+                    <pic:cNvPr id="0" name="ap-new-invoice.png"/>
+                    <pic:cNvPicPr/>
+                  </pic:nvPicPr>
+                  <pic:blipFill>
+                    <a:blip r:embed="rId11"/>
+                    <a:stretch>
+                      <a:fillRect/>
+                    </a:stretch>
+                  </pic:blipFill>
+                  <pic:spPr>
+                    <a:xfrm>
+                      <a:off x="0" y="0"/>
+                      <a:ext cx="6400800" cy="3720465"/>
+                    </a:xfrm>
+                    <a:prstGeom prst="rect"/>
+                  </pic:spPr>
+                </pic:pic>
+              </a:graphicData>
+            </a:graphic>
+          </wp:inline>
+        </w:drawing>
+      </w:r>
+    </w:p>
+    <w:p>
+      <w:pPr>
+        <w:spacing w:after="60"/>
+        <w:jc w:val="center"/>
+      </w:pPr>
+      <w:r>
+        <w:rPr>
+          <w:b/>
+          <w:color w:val="000000"/>
+          <w:sz w:val="18"/>
+        </w:rPr>
+        <w:t>Figure 1  New Invoice form</w:t>
+      </w:r>
+    </w:p>
+    <w:p>
+      <w:pPr>
+        <w:spacing w:after="200"/>
+        <w:jc w:val="center"/>
+      </w:pPr>
+      <w:r>
+        <w:rPr>
+          <w:color w:val="50565E"/>
+          <w:sz w:val="17"/>
+        </w:rPr>
+        <w:t>1 optional PO  |  2 verify extracted fields  |  3 choose approver  |  4 attach original  |  5 upload and notify</w:t>
       </w:r>
     </w:p>
     <w:p>
@@ -1338,6 +1406,74 @@
     </w:p>
     <w:p>
       <w:pPr>
+        <w:keepLines/>
+        <w:spacing w:before="160" w:after="80"/>
+        <w:jc w:val="center"/>
+      </w:pPr>
+      <w:r>
+        <w:drawing>
+          <wp:inline xmlns:a="http://schemas.openxmlformats.org/drawingml/2006/main" xmlns:pic="http://schemas.openxmlformats.org/drawingml/2006/picture">
+            <wp:extent cx="6400800" cy="3600450"/>
+            <wp:docPr id="2" name="Picture 2"/>
+            <wp:cNvGraphicFramePr>
+              <a:graphicFrameLocks noChangeAspect="1"/>
+            </wp:cNvGraphicFramePr>
+            <a:graphic>
+              <a:graphicData uri="http://schemas.openxmlformats.org/drawingml/2006/picture">
+                <pic:pic>
+                  <pic:nvPicPr>
+                    <pic:cNvPr id="0" name="ap-dashboard.png"/>
+                    <pic:cNvPicPr/>
+                  </pic:nvPicPr>
+                  <pic:blipFill>
+                    <a:blip r:embed="rId12"/>
+                    <a:stretch>
+                      <a:fillRect/>
+                    </a:stretch>
+                  </pic:blipFill>
+                  <pic:spPr>
+                    <a:xfrm>
+                      <a:off x="0" y="0"/>
+                      <a:ext cx="6400800" cy="3600450"/>
+                    </a:xfrm>
+                    <a:prstGeom prst="rect"/>
+                  </pic:spPr>
+                </pic:pic>
+              </a:graphicData>
+            </a:graphic>
+          </wp:inline>
+        </w:drawing>
+      </w:r>
+    </w:p>
+    <w:p>
+      <w:pPr>
+        <w:spacing w:after="60"/>
+        <w:jc w:val="center"/>
+      </w:pPr>
+      <w:r>
+        <w:rPr>
+          <w:b/>
+          <w:color w:val="000000"/>
+          <w:sz w:val="18"/>
+        </w:rPr>
+        <w:t>Figure 2  AP dashboard and reporting controls</w:t>
+      </w:r>
+    </w:p>
+    <w:p>
+      <w:pPr>
+        <w:spacing w:after="200"/>
+        <w:jc w:val="center"/>
+      </w:pPr>
+      <w:r>
+        <w:rPr>
+          <w:color w:val="50565E"/>
+          <w:sz w:val="17"/>
+        </w:rPr>
+        <w:t>1 start an invoice  |  2 choose a queue  |  3 search and filter  |  4 print or export the filtered view</w:t>
+      </w:r>
+    </w:p>
+    <w:p>
+      <w:pPr>
         <w:pStyle w:val="ListBullet"/>
         <w:spacing w:after="80"/>
       </w:pPr>
@@ -1536,6 +1672,74 @@
       </w:r>
       <w:r>
         <w:t>Use Correct or Reopen Closeout when a posted, paid, or archived record needs correction. TITAN requires a reason and preserves the prior values in history.</w:t>
+      </w:r>
+    </w:p>
+    <w:p>
+      <w:pPr>
+        <w:keepLines/>
+        <w:spacing w:before="160" w:after="80"/>
+        <w:jc w:val="center"/>
+      </w:pPr>
+      <w:r>
+        <w:drawing>
+          <wp:inline xmlns:a="http://schemas.openxmlformats.org/drawingml/2006/main" xmlns:pic="http://schemas.openxmlformats.org/drawingml/2006/picture">
+            <wp:extent cx="6400800" cy="3920490"/>
+            <wp:docPr id="3" name="Picture 3"/>
+            <wp:cNvGraphicFramePr>
+              <a:graphicFrameLocks noChangeAspect="1"/>
+            </wp:cNvGraphicFramePr>
+            <a:graphic>
+              <a:graphicData uri="http://schemas.openxmlformats.org/drawingml/2006/picture">
+                <pic:pic>
+                  <pic:nvPicPr>
+                    <pic:cNvPr id="0" name="ap-invoice-detail.png"/>
+                    <pic:cNvPicPr/>
+                  </pic:nvPicPr>
+                  <pic:blipFill>
+                    <a:blip r:embed="rId13"/>
+                    <a:stretch>
+                      <a:fillRect/>
+                    </a:stretch>
+                  </pic:blipFill>
+                  <pic:spPr>
+                    <a:xfrm>
+                      <a:off x="0" y="0"/>
+                      <a:ext cx="6400800" cy="3920490"/>
+                    </a:xfrm>
+                    <a:prstGeom prst="rect"/>
+                  </pic:spPr>
+                </pic:pic>
+              </a:graphicData>
+            </a:graphic>
+          </wp:inline>
+        </w:drawing>
+      </w:r>
+    </w:p>
+    <w:p>
+      <w:pPr>
+        <w:spacing w:after="60"/>
+        <w:jc w:val="center"/>
+      </w:pPr>
+      <w:r>
+        <w:rPr>
+          <w:b/>
+          <w:color w:val="000000"/>
+          <w:sz w:val="18"/>
+        </w:rPr>
+        <w:t>Figure 3  Invoice record and AP closeout</w:t>
+      </w:r>
+    </w:p>
+    <w:p>
+      <w:pPr>
+        <w:spacing w:after="200"/>
+        <w:jc w:val="center"/>
+      </w:pPr>
+      <w:r>
+        <w:rPr>
+          <w:color w:val="50565E"/>
+          <w:sz w:val="17"/>
+        </w:rPr>
+        <w:t>1 review the source  |  2 check the optional PO match  |  3 record closeout  |  4 download the approved packet</w:t>
       </w:r>
     </w:p>
     <w:p>

</xml_diff>